<commit_message>
Preparar versión 1.8.11 y app Flutter 0.1.10
</commit_message>
<xml_diff>
--- a/docs/Manual_Mensajeria_Gestinem.docx
+++ b/docs/Manual_Mensajeria_Gestinem.docx
@@ -4,13 +4,13 @@
   <w:body>
     <w:p>
       <w:pPr>
-        <w:spacing w:before="1100" w:after="720"/>
+        <w:spacing w:before="760" w:after="560"/>
         <w:jc w:val="center"/>
       </w:pPr>
       <w:r>
         <w:drawing>
           <wp:inline xmlns:a="http://schemas.openxmlformats.org/drawingml/2006/main" xmlns:pic="http://schemas.openxmlformats.org/drawingml/2006/picture">
-            <wp:extent cx="2971800" cy="1046252"/>
+            <wp:extent cx="3063240" cy="3063240"/>
             <wp:docPr id="1" name="Picture 1" descr="Logotipo corporativo de Gestinem"/>
             <wp:cNvGraphicFramePr>
               <a:graphicFrameLocks noChangeAspect="1"/>
@@ -19,11 +19,11 @@
               <a:graphicData uri="http://schemas.openxmlformats.org/drawingml/2006/picture">
                 <pic:pic>
                   <pic:nvPicPr>
-                    <pic:cNvPr id="0" name="gestinem-logo.png"/>
+                    <pic:cNvPr id="0" name="logo_new.png"/>
                     <pic:cNvPicPr/>
                   </pic:nvPicPr>
                   <pic:blipFill>
-                    <a:blip r:embed="rId11"/>
+                    <a:blip r:embed="rId10"/>
                     <a:stretch>
                       <a:fillRect/>
                     </a:stretch>
@@ -31,7 +31,7 @@
                   <pic:spPr>
                     <a:xfrm>
                       <a:off x="0" y="0"/>
-                      <a:ext cx="2971800" cy="1046252"/>
+                      <a:ext cx="3063240" cy="3063240"/>
                     </a:xfrm>
                     <a:prstGeom prst="rect"/>
                   </pic:spPr>
@@ -44,112 +44,93 @@
     </w:p>
     <w:p>
       <w:pPr>
-        <w:spacing w:after="240"/>
         <w:jc w:val="center"/>
       </w:pPr>
       <w:r>
         <w:rPr>
-          <w:rFonts w:ascii="Calibri" w:hAnsi="Calibri"/>
+          <w:rFonts w:ascii="Aptos" w:hAnsi="Aptos"/>
           <w:b/>
+          <w:i w:val="0"/>
           <w:color w:val="0759AF"/>
           <w:sz w:val="20"/>
         </w:rPr>
-        <w:t>NUEVO CANAL DE COMUNICACIÓN</w:t>
+        <w:t>NUEVA APLICACIÓN PARA CLIENTES</w:t>
       </w:r>
     </w:p>
     <w:p>
       <w:pPr>
-        <w:spacing w:after="200"/>
+        <w:spacing w:before="180" w:after="160"/>
         <w:jc w:val="center"/>
       </w:pPr>
       <w:r>
         <w:rPr>
-          <w:rFonts w:ascii="Calibri" w:hAnsi="Calibri"/>
+          <w:rFonts w:ascii="Aptos" w:hAnsi="Aptos"/>
           <w:b/>
-          <w:color w:val="00345D"/>
-          <w:sz w:val="58"/>
+          <w:i w:val="0"/>
+          <w:color w:val="0D2A6B"/>
+          <w:sz w:val="62"/>
         </w:rPr>
-        <w:t>Mensajería Gestinem</w:t>
+        <w:t>Gestinem</w:t>
       </w:r>
     </w:p>
     <w:p>
       <w:pPr>
-        <w:spacing w:after="600"/>
+        <w:spacing w:after="520"/>
         <w:jc w:val="center"/>
       </w:pPr>
       <w:r>
         <w:rPr>
-          <w:rFonts w:ascii="Calibri" w:hAnsi="Calibri"/>
+          <w:rFonts w:ascii="Aptos" w:hAnsi="Aptos"/>
+          <w:b w:val="0"/>
+          <w:i w:val="0"/>
           <w:color w:val="5D6B78"/>
-          <w:sz w:val="30"/>
+          <w:sz w:val="32"/>
         </w:rPr>
-        <w:t>Guía rápida para clientes</w:t>
+        <w:t>Guía rápida de acceso y mensajería</w:t>
       </w:r>
     </w:p>
     <w:p>
       <w:pPr>
-        <w:spacing w:after="480"/>
-        <w:jc w:val="center"/>
+        <w:spacing w:before="120" w:after="200" w:line="269" w:lineRule="auto"/>
+        <w:ind w:left="259" w:right="259"/>
+        <w:shd w:fill="EEF4FA"/>
       </w:pPr>
       <w:r>
-        <w:drawing>
-          <wp:inline xmlns:a="http://schemas.openxmlformats.org/drawingml/2006/main" xmlns:pic="http://schemas.openxmlformats.org/drawingml/2006/picture">
-            <wp:extent cx="1143000" cy="1143000"/>
-            <wp:docPr id="2" name="Picture 2" descr="Icono corporativo de Gestinem con la letra G"/>
-            <wp:cNvGraphicFramePr>
-              <a:graphicFrameLocks noChangeAspect="1"/>
-            </wp:cNvGraphicFramePr>
-            <a:graphic>
-              <a:graphicData uri="http://schemas.openxmlformats.org/drawingml/2006/picture">
-                <pic:pic>
-                  <pic:nvPicPr>
-                    <pic:cNvPr id="0" name="gestinem-icon-512.png"/>
-                    <pic:cNvPicPr/>
-                  </pic:nvPicPr>
-                  <pic:blipFill>
-                    <a:blip r:embed="rId12"/>
-                    <a:stretch>
-                      <a:fillRect/>
-                    </a:stretch>
-                  </pic:blipFill>
-                  <pic:spPr>
-                    <a:xfrm>
-                      <a:off x="0" y="0"/>
-                      <a:ext cx="1143000" cy="1143000"/>
-                    </a:xfrm>
-                    <a:prstGeom prst="rect"/>
-                  </pic:spPr>
-                </pic:pic>
-              </a:graphicData>
-            </a:graphic>
-          </wp:inline>
-        </w:drawing>
+        <w:rPr>
+          <w:rFonts w:ascii="Aptos" w:hAnsi="Aptos"/>
+          <w:b/>
+          <w:i w:val="0"/>
+          <w:color w:val="0D2A6B"/>
+          <w:sz w:val="22"/>
+        </w:rPr>
+        <w:t>Disponible desde el navegador</w:t>
+        <w:br/>
+      </w:r>
+      <w:r>
+        <w:rPr>
+          <w:rFonts w:ascii="Aptos" w:hAnsi="Aptos"/>
+          <w:b w:val="0"/>
+          <w:i w:val="0"/>
+          <w:color w:val="183247"/>
+          <w:sz w:val="21"/>
+        </w:rPr>
+        <w:t>Las versiones para las tiendas de aplicaciones se publicarán próximamente. Mientras tanto, puede utilizar Gestinem desde Chrome, Edge, Safari o Brave en su móvil, tableta u ordenador. No necesita instalar ningún programa.</w:t>
       </w:r>
     </w:p>
     <w:p>
       <w:pPr>
-        <w:spacing w:before="120" w:after="200" w:line="276" w:lineRule="auto"/>
-        <w:ind w:left="259" w:right="259"/>
-        <w:shd w:fill="EEF3F8"/>
+        <w:spacing w:before="400"/>
+        <w:jc w:val="center"/>
       </w:pPr>
-      <w:r>
-        <w:rPr>
-          <w:rFonts w:ascii="Calibri" w:hAnsi="Calibri"/>
-          <w:b/>
-          <w:color w:val="00345D"/>
-          <w:sz w:val="22"/>
-        </w:rPr>
-        <w:t>Una comunicación más ordenada y segura</w:t>
-        <w:br/>
-      </w:r>
-      <w:r>
-        <w:rPr>
-          <w:rFonts w:ascii="Calibri" w:hAnsi="Calibri"/>
-          <w:color w:val="183247"/>
-          <w:sz w:val="21"/>
-        </w:rPr>
-        <w:t>Queremos sustituir progresivamente las conversaciones de WhatsApp por la Mensajería Gestinem. Así, sus consultas y documentos llegarán al equipo adecuado y quedarán vinculados a su relación con el despacho.</w:t>
-      </w:r>
+      <w:hyperlink r:id="rId11">
+        <w:r>
+          <w:rPr>
+            <w:color w:val="0759AF"/>
+            <w:u w:val="single"/>
+          </w:rPr>
+          <w:t>https://app.gestinem.es</w:t>
+        </w:r>
+      </w:hyperlink>
     </w:p>
     <w:p>
       <w:pPr>
@@ -157,12 +138,13 @@
       </w:pPr>
       <w:r>
         <w:rPr>
-          <w:rFonts w:ascii="Calibri" w:hAnsi="Calibri"/>
+          <w:rFonts w:ascii="Aptos" w:hAnsi="Aptos"/>
+          <w:b w:val="0"/>
           <w:i/>
           <w:color w:val="5D6B78"/>
-          <w:sz w:val="19"/>
+          <w:sz w:val="20"/>
         </w:rPr>
-        <w:t>Acceso desde móvil, tableta u ordenador · No necesita instalar Gest2A3Eco</w:t>
+        <w:t>Comunicación segura, ordenada y vinculada a su empresa</w:t>
       </w:r>
     </w:p>
     <w:p>
@@ -176,117 +158,28 @@
         <w:keepNext/>
       </w:pPr>
       <w:r>
-        <w:t>1. ¿Por qué cambiamos WhatsApp?</w:t>
-      </w:r>
-    </w:p>
-    <w:p>
-      <w:r>
-        <w:t>La Mensajería Gestinem reúne en un único lugar las conversaciones del cliente con el despacho. El cambio evita depender de teléfonos personales y permite que cada consulta sea atendida por las personas responsables.</w:t>
+        <w:t>1. Active su cuenta</w:t>
       </w:r>
     </w:p>
     <w:p>
       <w:pPr>
-        <w:spacing w:after="140"/>
+        <w:spacing w:after="240"/>
       </w:pPr>
       <w:r>
         <w:rPr>
-          <w:rFonts w:ascii="Calibri" w:hAnsi="Calibri"/>
-          <w:b/>
-          <w:color w:val="00345D"/>
+          <w:rFonts w:ascii="Aptos" w:hAnsi="Aptos"/>
+          <w:b w:val="0"/>
+          <w:i w:val="0"/>
+          <w:color w:val="5D6B78"/>
           <w:sz w:val="22"/>
         </w:rPr>
-        <w:t xml:space="preserve">Laboral. </w:t>
-      </w:r>
-      <w:r>
-        <w:rPr>
-          <w:rFonts w:ascii="Calibri" w:hAnsi="Calibri"/>
-          <w:color w:val="183247"/>
-          <w:sz w:val="22"/>
-        </w:rPr>
-        <w:t>Consultas y documentación de nóminas, contratos, altas, bajas y Seguridad Social.</w:t>
+        <w:t>El enlace recibido por correo es personal y caduca en 72 horas.</w:t>
       </w:r>
     </w:p>
     <w:p>
       <w:pPr>
-        <w:spacing w:after="140"/>
-      </w:pPr>
-      <w:r>
-        <w:rPr>
-          <w:rFonts w:ascii="Calibri" w:hAnsi="Calibri"/>
-          <w:b/>
-          <w:color w:val="00345D"/>
-          <w:sz w:val="22"/>
-        </w:rPr>
-        <w:t xml:space="preserve">Contable / Fiscal. </w:t>
-      </w:r>
-      <w:r>
-        <w:rPr>
-          <w:rFonts w:ascii="Calibri" w:hAnsi="Calibri"/>
-          <w:color w:val="183247"/>
-          <w:sz w:val="22"/>
-        </w:rPr>
-        <w:t>Facturas, impuestos, contabilidad y documentación económica.</w:t>
-      </w:r>
-    </w:p>
-    <w:p>
-      <w:pPr>
-        <w:spacing w:after="140"/>
-      </w:pPr>
-      <w:r>
-        <w:rPr>
-          <w:rFonts w:ascii="Calibri" w:hAnsi="Calibri"/>
-          <w:b/>
-          <w:color w:val="00345D"/>
-          <w:sz w:val="22"/>
-        </w:rPr>
-        <w:t xml:space="preserve">Privado. </w:t>
-      </w:r>
-      <w:r>
-        <w:rPr>
-          <w:rFonts w:ascii="Calibri" w:hAnsi="Calibri"/>
-          <w:color w:val="183247"/>
-          <w:sz w:val="22"/>
-        </w:rPr>
-        <w:t>Conversación directa y reservada con la dirección del despacho.</w:t>
-      </w:r>
-    </w:p>
-    <w:p>
-      <w:pPr>
-        <w:spacing w:before="120" w:after="200" w:line="276" w:lineRule="auto"/>
-        <w:ind w:left="259" w:right="259"/>
-        <w:shd w:fill="FFF7E8"/>
-      </w:pPr>
-      <w:r>
-        <w:rPr>
-          <w:rFonts w:ascii="Calibri" w:hAnsi="Calibri"/>
-          <w:b/>
-          <w:color w:val="7A5A00"/>
-          <w:sz w:val="22"/>
-        </w:rPr>
-        <w:t>Importante</w:t>
-        <w:br/>
-      </w:r>
-      <w:r>
-        <w:rPr>
-          <w:rFonts w:ascii="Calibri" w:hAnsi="Calibri"/>
-          <w:color w:val="183247"/>
-          <w:sz w:val="21"/>
-        </w:rPr>
-        <w:t>Use el canal correspondiente para que su mensaje llegue desde el primer momento al equipo que debe gestionarlo. Los documentos enviados quedan disponibles para su incorporación al expediente o a la gestión documental.</w:t>
-      </w:r>
-    </w:p>
-    <w:p>
-      <w:pPr>
-        <w:pStyle w:val="Heading2"/>
-      </w:pPr>
-      <w:r>
-        <w:t>Qué necesita</w:t>
-      </w:r>
-    </w:p>
-    <w:p>
-      <w:pPr>
-        <w:spacing w:after="80" w:line="300" w:lineRule="auto"/>
-        <w:ind w:left="540" w:hanging="271"/>
+        <w:spacing w:after="100"/>
+        <w:ind w:left="547" w:hanging="274"/>
         <w:numPr>
           <w:ilvl w:val="0"/>
           <w:numId w:val="10"/>
@@ -294,17 +187,19 @@
       </w:pPr>
       <w:r>
         <w:rPr>
-          <w:rFonts w:ascii="Calibri" w:hAnsi="Calibri"/>
+          <w:rFonts w:ascii="Aptos" w:hAnsi="Aptos"/>
+          <w:b w:val="0"/>
+          <w:i w:val="0"/>
           <w:color w:val="183247"/>
           <w:sz w:val="22"/>
         </w:rPr>
-        <w:t>Una invitación enviada por Gestinem a su correo electrónico.</w:t>
+        <w:t>Abra el correo de invitación enviado por Gestinem.</w:t>
       </w:r>
     </w:p>
     <w:p>
       <w:pPr>
-        <w:spacing w:after="80" w:line="300" w:lineRule="auto"/>
-        <w:ind w:left="540" w:hanging="271"/>
+        <w:spacing w:after="100"/>
+        <w:ind w:left="547" w:hanging="274"/>
         <w:numPr>
           <w:ilvl w:val="0"/>
           <w:numId w:val="10"/>
@@ -312,17 +207,19 @@
       </w:pPr>
       <w:r>
         <w:rPr>
-          <w:rFonts w:ascii="Calibri" w:hAnsi="Calibri"/>
+          <w:rFonts w:ascii="Aptos" w:hAnsi="Aptos"/>
+          <w:b w:val="0"/>
+          <w:i w:val="0"/>
           <w:color w:val="183247"/>
           <w:sz w:val="22"/>
         </w:rPr>
-        <w:t>Un navegador actualizado: Brave, Chrome, Edge o Safari.</w:t>
+        <w:t>Pulse Activar mi cuenta y abrir Gestinem. Se abrirá la aplicación en su navegador.</w:t>
       </w:r>
     </w:p>
     <w:p>
       <w:pPr>
-        <w:spacing w:after="80" w:line="300" w:lineRule="auto"/>
-        <w:ind w:left="540" w:hanging="271"/>
+        <w:spacing w:after="100"/>
+        <w:ind w:left="547" w:hanging="274"/>
         <w:numPr>
           <w:ilvl w:val="0"/>
           <w:numId w:val="10"/>
@@ -330,11 +227,117 @@
       </w:pPr>
       <w:r>
         <w:rPr>
-          <w:rFonts w:ascii="Calibri" w:hAnsi="Calibri"/>
+          <w:rFonts w:ascii="Aptos" w:hAnsi="Aptos"/>
+          <w:b w:val="0"/>
+          <w:i w:val="0"/>
           <w:color w:val="183247"/>
           <w:sz w:val="22"/>
         </w:rPr>
-        <w:t>Una contraseña personal de al menos 10 caracteres.</w:t>
+        <w:t>Cree una contraseña personal de al menos 10 caracteres.</w:t>
+      </w:r>
+    </w:p>
+    <w:p>
+      <w:pPr>
+        <w:spacing w:after="100"/>
+        <w:ind w:left="547" w:hanging="274"/>
+        <w:numPr>
+          <w:ilvl w:val="0"/>
+          <w:numId w:val="10"/>
+        </w:numPr>
+      </w:pPr>
+      <w:r>
+        <w:rPr>
+          <w:rFonts w:ascii="Aptos" w:hAnsi="Aptos"/>
+          <w:b w:val="0"/>
+          <w:i w:val="0"/>
+          <w:color w:val="183247"/>
+          <w:sz w:val="22"/>
+        </w:rPr>
+        <w:t>Entre con su correo y la nueva contraseña.</w:t>
+      </w:r>
+    </w:p>
+    <w:p>
+      <w:pPr>
+        <w:spacing w:after="60"/>
+        <w:jc w:val="center"/>
+      </w:pPr>
+      <w:r>
+        <w:drawing>
+          <wp:inline xmlns:a="http://schemas.openxmlformats.org/drawingml/2006/main" xmlns:pic="http://schemas.openxmlformats.org/drawingml/2006/picture">
+            <wp:extent cx="5806440" cy="3677412"/>
+            <wp:docPr id="2" name="Picture 2" descr="Acceso a Gestinem desde un navegador actualizado."/>
+            <wp:cNvGraphicFramePr>
+              <a:graphicFrameLocks noChangeAspect="1"/>
+            </wp:cNvGraphicFramePr>
+            <a:graphic>
+              <a:graphicData uri="http://schemas.openxmlformats.org/drawingml/2006/picture">
+                <pic:pic>
+                  <pic:nvPicPr>
+                    <pic:cNvPr id="0" name="01-acceso-web.png"/>
+                    <pic:cNvPicPr/>
+                  </pic:nvPicPr>
+                  <pic:blipFill>
+                    <a:blip r:embed="rId12"/>
+                    <a:stretch>
+                      <a:fillRect/>
+                    </a:stretch>
+                  </pic:blipFill>
+                  <pic:spPr>
+                    <a:xfrm>
+                      <a:off x="0" y="0"/>
+                      <a:ext cx="5806440" cy="3677412"/>
+                    </a:xfrm>
+                    <a:prstGeom prst="rect"/>
+                  </pic:spPr>
+                </pic:pic>
+              </a:graphicData>
+            </a:graphic>
+          </wp:inline>
+        </w:drawing>
+      </w:r>
+    </w:p>
+    <w:p>
+      <w:pPr>
+        <w:spacing w:after="160"/>
+        <w:jc w:val="center"/>
+      </w:pPr>
+      <w:r>
+        <w:rPr>
+          <w:rFonts w:ascii="Aptos" w:hAnsi="Aptos"/>
+          <w:b w:val="0"/>
+          <w:i/>
+          <w:color w:val="5D6B78"/>
+          <w:sz w:val="17"/>
+        </w:rPr>
+        <w:t>Acceso a Gestinem desde un navegador actualizado.</w:t>
+      </w:r>
+    </w:p>
+    <w:p>
+      <w:pPr>
+        <w:spacing w:before="120" w:after="200" w:line="269" w:lineRule="auto"/>
+        <w:ind w:left="259" w:right="259"/>
+        <w:shd w:fill="F7F9FC"/>
+      </w:pPr>
+      <w:r>
+        <w:rPr>
+          <w:rFonts w:ascii="Aptos" w:hAnsi="Aptos"/>
+          <w:b/>
+          <w:i w:val="0"/>
+          <w:color w:val="0759AF"/>
+          <w:sz w:val="22"/>
+        </w:rPr>
+        <w:t>Guarde esta dirección</w:t>
+        <w:br/>
+      </w:r>
+      <w:r>
+        <w:rPr>
+          <w:rFonts w:ascii="Aptos" w:hAnsi="Aptos"/>
+          <w:b w:val="0"/>
+          <w:i w:val="0"/>
+          <w:color w:val="183247"/>
+          <w:sz w:val="21"/>
+        </w:rPr>
+        <w:t>Para volver a entrar, escriba https://app.gestinem.es en el navegador o guárdela en Favoritos. Cuando las versiones de tienda estén disponibles, Gestinem informará de su publicación.</w:t>
       </w:r>
     </w:p>
     <w:p>
@@ -348,115 +351,24 @@
         <w:keepNext/>
       </w:pPr>
       <w:r>
-        <w:t>2. Primer acceso</w:t>
+        <w:t>2. Elija el canal adecuado</w:t>
+      </w:r>
+    </w:p>
+    <w:p>
+      <w:r>
+        <w:t>Cada canal dirige su consulta al equipo correspondiente y mantiene juntos los mensajes y documentos relacionados.</w:t>
       </w:r>
     </w:p>
     <w:p>
       <w:pPr>
-        <w:spacing w:after="240"/>
-      </w:pPr>
-      <w:r>
-        <w:rPr>
-          <w:rFonts w:ascii="Calibri" w:hAnsi="Calibri"/>
-          <w:color w:val="5D6B78"/>
-          <w:sz w:val="22"/>
-        </w:rPr>
-        <w:t>Active su cuenta desde la invitación y entre con su correo habitual.</w:t>
-      </w:r>
-    </w:p>
-    <w:p>
-      <w:pPr>
-        <w:spacing w:after="80" w:line="300" w:lineRule="auto"/>
-        <w:ind w:left="540" w:hanging="271"/>
-        <w:numPr>
-          <w:ilvl w:val="0"/>
-          <w:numId w:val="11"/>
-        </w:numPr>
-      </w:pPr>
-      <w:r>
-        <w:rPr>
-          <w:rFonts w:ascii="Calibri" w:hAnsi="Calibri"/>
-          <w:color w:val="183247"/>
-          <w:sz w:val="22"/>
-        </w:rPr>
-        <w:t>Abra el correo de invitación de Gestinem y pulse el enlace de activación.</w:t>
-      </w:r>
-    </w:p>
-    <w:p>
-      <w:pPr>
-        <w:spacing w:after="80" w:line="300" w:lineRule="auto"/>
-        <w:ind w:left="540" w:hanging="271"/>
-        <w:numPr>
-          <w:ilvl w:val="0"/>
-          <w:numId w:val="11"/>
-        </w:numPr>
-      </w:pPr>
-      <w:r>
-        <w:rPr>
-          <w:rFonts w:ascii="Calibri" w:hAnsi="Calibri"/>
-          <w:color w:val="183247"/>
-          <w:sz w:val="22"/>
-        </w:rPr>
-        <w:t>Cree una contraseña de al menos 10 caracteres y guárdela de forma segura.</w:t>
-      </w:r>
-    </w:p>
-    <w:p>
-      <w:pPr>
-        <w:spacing w:after="80" w:line="300" w:lineRule="auto"/>
-        <w:ind w:left="540" w:hanging="271"/>
-        <w:numPr>
-          <w:ilvl w:val="0"/>
-          <w:numId w:val="11"/>
-        </w:numPr>
-      </w:pPr>
-      <w:r>
-        <w:rPr>
-          <w:rFonts w:ascii="Calibri" w:hAnsi="Calibri"/>
-          <w:color w:val="183247"/>
-          <w:sz w:val="22"/>
-        </w:rPr>
-        <w:t>Entre con su email y contraseña desde la dirección que aparece debajo.</w:t>
-      </w:r>
-    </w:p>
-    <w:p>
-      <w:pPr>
-        <w:spacing w:after="40"/>
-        <w:jc w:val="center"/>
-      </w:pPr>
-      <w:hyperlink r:id="rId13">
-        <w:r>
-          <w:rPr>
-            <w:color w:val="0759AF"/>
-            <w:u w:val="single"/>
-          </w:rPr>
-          <w:t>Abrir Mensajería Gestinem</w:t>
-        </w:r>
-      </w:hyperlink>
-    </w:p>
-    <w:p>
-      <w:pPr>
-        <w:spacing w:after="160"/>
-        <w:jc w:val="center"/>
-      </w:pPr>
-      <w:r>
-        <w:rPr>
-          <w:rFonts w:ascii="Calibri" w:hAnsi="Calibri"/>
-          <w:color w:val="5D6B78"/>
-          <w:sz w:val="17"/>
-        </w:rPr>
-        <w:t>https://gest2a3eco-production.up.railway.app/mensajes</w:t>
-      </w:r>
-    </w:p>
-    <w:p>
-      <w:pPr>
-        <w:spacing w:before="80" w:after="60"/>
+        <w:spacing w:after="60"/>
         <w:jc w:val="center"/>
       </w:pPr>
       <w:r>
         <w:drawing>
           <wp:inline xmlns:a="http://schemas.openxmlformats.org/drawingml/2006/main" xmlns:pic="http://schemas.openxmlformats.org/drawingml/2006/picture">
-            <wp:extent cx="2788920" cy="3858457"/>
-            <wp:docPr id="3" name="Picture 3" descr="Pantalla real de acceso al Área de clientes."/>
+            <wp:extent cx="3749039" cy="4423866"/>
+            <wp:docPr id="3" name="Picture 3" descr="Canales disponibles en la aplicación Gestinem."/>
             <wp:cNvGraphicFramePr>
               <a:graphicFrameLocks noChangeAspect="1"/>
             </wp:cNvGraphicFramePr>
@@ -464,11 +376,11 @@
               <a:graphicData uri="http://schemas.openxmlformats.org/drawingml/2006/picture">
                 <pic:pic>
                   <pic:nvPicPr>
-                    <pic:cNvPr id="0" name="01-acceso-clientes-recortada.png"/>
+                    <pic:cNvPr id="0" name="02-canales.png"/>
                     <pic:cNvPicPr/>
                   </pic:nvPicPr>
                   <pic:blipFill>
-                    <a:blip r:embed="rId14"/>
+                    <a:blip r:embed="rId13"/>
                     <a:stretch>
                       <a:fillRect/>
                     </a:stretch>
@@ -476,7 +388,7 @@
                   <pic:spPr>
                     <a:xfrm>
                       <a:off x="0" y="0"/>
-                      <a:ext cx="2788920" cy="3858457"/>
+                      <a:ext cx="3749039" cy="4423866"/>
                     </a:xfrm>
                     <a:prstGeom prst="rect"/>
                   </pic:spPr>
@@ -489,42 +401,84 @@
     </w:p>
     <w:p>
       <w:pPr>
-        <w:spacing w:before="0" w:after="160"/>
+        <w:spacing w:after="160"/>
         <w:jc w:val="center"/>
       </w:pPr>
       <w:r>
         <w:rPr>
-          <w:rFonts w:ascii="Calibri" w:hAnsi="Calibri"/>
+          <w:rFonts w:ascii="Aptos" w:hAnsi="Aptos"/>
+          <w:b w:val="0"/>
           <w:i/>
           <w:color w:val="5D6B78"/>
           <w:sz w:val="17"/>
         </w:rPr>
-        <w:t>Pantalla real de acceso al Área de clientes.</w:t>
+        <w:t>Canales disponibles en la aplicación Gestinem.</w:t>
       </w:r>
     </w:p>
     <w:p>
-      <w:pPr>
-        <w:spacing w:before="120" w:after="200" w:line="276" w:lineRule="auto"/>
-        <w:ind w:left="259" w:right="259"/>
-        <w:shd w:fill="F5F8FB"/>
-      </w:pPr>
       <w:r>
         <w:rPr>
-          <w:rFonts w:ascii="Calibri" w:hAnsi="Calibri"/>
+          <w:rFonts w:ascii="Aptos" w:hAnsi="Aptos"/>
           <w:b/>
-          <w:color w:val="0759AF"/>
+          <w:i w:val="0"/>
+          <w:color w:val="0D2A6B"/>
           <w:sz w:val="22"/>
         </w:rPr>
-        <w:t>¿Ha olvidado la contraseña?</w:t>
-        <w:br/>
+        <w:t xml:space="preserve">Laboral. </w:t>
       </w:r>
       <w:r>
         <w:rPr>
-          <w:rFonts w:ascii="Calibri" w:hAnsi="Calibri"/>
+          <w:rFonts w:ascii="Aptos" w:hAnsi="Aptos"/>
+          <w:b w:val="0"/>
+          <w:i w:val="0"/>
           <w:color w:val="183247"/>
-          <w:sz w:val="21"/>
+          <w:sz w:val="22"/>
         </w:rPr>
-        <w:t>Pulse ¿Has olvidado tu contraseña? en la pantalla de acceso. Recibirá un enlace seguro para crear una nueva.</w:t>
+        <w:t>Nóminas, contratos, altas, bajas y Seguridad Social.</w:t>
+      </w:r>
+    </w:p>
+    <w:p>
+      <w:r>
+        <w:rPr>
+          <w:rFonts w:ascii="Aptos" w:hAnsi="Aptos"/>
+          <w:b/>
+          <w:i w:val="0"/>
+          <w:color w:val="0D2A6B"/>
+          <w:sz w:val="22"/>
+        </w:rPr>
+        <w:t xml:space="preserve">Contable / Fiscal. </w:t>
+      </w:r>
+      <w:r>
+        <w:rPr>
+          <w:rFonts w:ascii="Aptos" w:hAnsi="Aptos"/>
+          <w:b w:val="0"/>
+          <w:i w:val="0"/>
+          <w:color w:val="183247"/>
+          <w:sz w:val="22"/>
+        </w:rPr>
+        <w:t>Facturas, impuestos, contabilidad y documentación económica.</w:t>
+      </w:r>
+    </w:p>
+    <w:p>
+      <w:r>
+        <w:rPr>
+          <w:rFonts w:ascii="Aptos" w:hAnsi="Aptos"/>
+          <w:b/>
+          <w:i w:val="0"/>
+          <w:color w:val="0D2A6B"/>
+          <w:sz w:val="22"/>
+        </w:rPr>
+        <w:t xml:space="preserve">Directo. </w:t>
+      </w:r>
+      <w:r>
+        <w:rPr>
+          <w:rFonts w:ascii="Aptos" w:hAnsi="Aptos"/>
+          <w:b w:val="0"/>
+          <w:i w:val="0"/>
+          <w:color w:val="183247"/>
+          <w:sz w:val="22"/>
+        </w:rPr>
+        <w:t>Conversación reservada con la persona responsable del despacho.</w:t>
       </w:r>
     </w:p>
     <w:p>
@@ -538,20 +492,115 @@
         <w:keepNext/>
       </w:pPr>
       <w:r>
-        <w:t>3. Instalar la aplicación</w:t>
+        <w:t>3. Envie mensajes y documentos</w:t>
       </w:r>
     </w:p>
     <w:p>
       <w:pPr>
-        <w:spacing w:after="240"/>
+        <w:spacing w:after="100"/>
+        <w:ind w:left="547" w:hanging="274"/>
+        <w:numPr>
+          <w:ilvl w:val="0"/>
+          <w:numId w:val="11"/>
+        </w:numPr>
       </w:pPr>
       <w:r>
         <w:rPr>
-          <w:rFonts w:ascii="Calibri" w:hAnsi="Calibri"/>
-          <w:color w:val="5D6B78"/>
+          <w:rFonts w:ascii="Aptos" w:hAnsi="Aptos"/>
+          <w:b w:val="0"/>
+          <w:i w:val="0"/>
+          <w:color w:val="183247"/>
           <w:sz w:val="22"/>
         </w:rPr>
-        <w:t>La instalación crea un icono de la G y abre la mensajería como una aplicación independiente.</w:t>
+        <w:t>Abra Laboral, Contable / Fiscal o Directo.</w:t>
+      </w:r>
+    </w:p>
+    <w:p>
+      <w:pPr>
+        <w:spacing w:after="100"/>
+        <w:ind w:left="547" w:hanging="274"/>
+        <w:numPr>
+          <w:ilvl w:val="0"/>
+          <w:numId w:val="11"/>
+        </w:numPr>
+      </w:pPr>
+      <w:r>
+        <w:rPr>
+          <w:rFonts w:ascii="Aptos" w:hAnsi="Aptos"/>
+          <w:b w:val="0"/>
+          <w:i w:val="0"/>
+          <w:color w:val="183247"/>
+          <w:sz w:val="22"/>
+        </w:rPr>
+        <w:t>Escriba un mensaje breve que explique qué necesita.</w:t>
+      </w:r>
+    </w:p>
+    <w:p>
+      <w:pPr>
+        <w:spacing w:after="100"/>
+        <w:ind w:left="547" w:hanging="274"/>
+        <w:numPr>
+          <w:ilvl w:val="0"/>
+          <w:numId w:val="11"/>
+        </w:numPr>
+      </w:pPr>
+      <w:r>
+        <w:rPr>
+          <w:rFonts w:ascii="Aptos" w:hAnsi="Aptos"/>
+          <w:b w:val="0"/>
+          <w:i w:val="0"/>
+          <w:color w:val="183247"/>
+          <w:sz w:val="22"/>
+        </w:rPr>
+        <w:t>Para enviar archivos, pulse el icono de adjuntar y seleccione uno o varios documentos.</w:t>
+      </w:r>
+    </w:p>
+    <w:p>
+      <w:pPr>
+        <w:spacing w:after="100"/>
+        <w:ind w:left="547" w:hanging="274"/>
+        <w:numPr>
+          <w:ilvl w:val="0"/>
+          <w:numId w:val="11"/>
+        </w:numPr>
+      </w:pPr>
+      <w:r>
+        <w:rPr>
+          <w:rFonts w:ascii="Aptos" w:hAnsi="Aptos"/>
+          <w:b w:val="0"/>
+          <w:i w:val="0"/>
+          <w:color w:val="183247"/>
+          <w:sz w:val="22"/>
+        </w:rPr>
+        <w:t>Compruebe los nombres de los archivos y pulse Enviar una sola vez.</w:t>
+      </w:r>
+    </w:p>
+    <w:p>
+      <w:pPr>
+        <w:spacing w:before="120" w:after="200" w:line="269" w:lineRule="auto"/>
+        <w:ind w:left="259" w:right="259"/>
+        <w:shd w:fill="EEF4FA"/>
+      </w:pPr>
+      <w:r>
+        <w:rPr>
+          <w:rFonts w:ascii="Aptos" w:hAnsi="Aptos"/>
+          <w:b/>
+          <w:i w:val="0"/>
+          <w:color w:val="0D2A6B"/>
+          <w:sz w:val="22"/>
+        </w:rPr>
+        <w:t>Formatos habituales</w:t>
+        <w:br/>
+      </w:r>
+      <w:r>
+        <w:rPr>
+          <w:rFonts w:ascii="Aptos" w:hAnsi="Aptos"/>
+          <w:b w:val="0"/>
+          <w:i w:val="0"/>
+          <w:color w:val="183247"/>
+          <w:sz w:val="21"/>
+        </w:rPr>
+        <w:t>Puede enviar PDF, imágenes, documentos de Word, hojas de cálculo, XML, CSV y ZIP. Utilice nombres claros, por ejemplo Factura_Luz_Agosto_2026.pdf.</w:t>
       </w:r>
     </w:p>
     <w:p>
@@ -559,116 +608,40 @@
         <w:pStyle w:val="Heading2"/>
       </w:pPr>
       <w:r>
-        <w:t>Android: Brave o Chrome</w:t>
+        <w:t>Qué ocurre con los documentos</w:t>
+      </w:r>
+    </w:p>
+    <w:p>
+      <w:r>
+        <w:t>Los archivos enviados quedan asociados a su conversación. Gestinem puede incorporarlos al expediente o a la gestión documental del despacho sin depender de teléfonos personales.</w:t>
       </w:r>
     </w:p>
     <w:p>
       <w:pPr>
-        <w:spacing w:after="80" w:line="300" w:lineRule="auto"/>
-        <w:ind w:left="540" w:hanging="271"/>
-        <w:numPr>
-          <w:ilvl w:val="0"/>
-          <w:numId w:val="12"/>
-        </w:numPr>
+        <w:spacing w:before="120" w:after="200" w:line="269" w:lineRule="auto"/>
+        <w:ind w:left="259" w:right="259"/>
+        <w:shd w:fill="FFF7E8"/>
       </w:pPr>
       <w:r>
         <w:rPr>
-          <w:rFonts w:ascii="Calibri" w:hAnsi="Calibri"/>
-          <w:color w:val="183247"/>
+          <w:rFonts w:ascii="Aptos" w:hAnsi="Aptos"/>
+          <w:b/>
+          <w:i w:val="0"/>
+          <w:color w:val="7A5A00"/>
           <w:sz w:val="22"/>
         </w:rPr>
-        <w:t>Abra directamente la dirección de Mensajería Gestinem en Brave o Chrome.</w:t>
+        <w:t>Evite duplicados</w:t>
+        <w:br/>
       </w:r>
-    </w:p>
-    <w:p>
-      <w:pPr>
-        <w:spacing w:after="80" w:line="300" w:lineRule="auto"/>
-        <w:ind w:left="540" w:hanging="271"/>
-        <w:numPr>
-          <w:ilvl w:val="0"/>
-          <w:numId w:val="12"/>
-        </w:numPr>
-      </w:pPr>
       <w:r>
         <w:rPr>
-          <w:rFonts w:ascii="Calibri" w:hAnsi="Calibri"/>
+          <w:rFonts w:ascii="Aptos" w:hAnsi="Aptos"/>
+          <w:b w:val="0"/>
+          <w:i w:val="0"/>
           <w:color w:val="183247"/>
-          <w:sz w:val="22"/>
+          <w:sz w:val="21"/>
         </w:rPr>
-        <w:t>Pulse el menú de tres puntos (⋮) y elija Instalar aplicación.</w:t>
-      </w:r>
-    </w:p>
-    <w:p>
-      <w:pPr>
-        <w:spacing w:after="80" w:line="300" w:lineRule="auto"/>
-        <w:ind w:left="540" w:hanging="271"/>
-        <w:numPr>
-          <w:ilvl w:val="0"/>
-          <w:numId w:val="12"/>
-        </w:numPr>
-      </w:pPr>
-      <w:r>
-        <w:rPr>
-          <w:rFonts w:ascii="Calibri" w:hAnsi="Calibri"/>
-          <w:color w:val="183247"/>
-          <w:sz w:val="22"/>
-        </w:rPr>
-        <w:t>Confirme y abra el nuevo icono de la G desde la pantalla de inicio.</w:t>
-      </w:r>
-    </w:p>
-    <w:p>
-      <w:pPr>
-        <w:spacing w:before="80" w:after="60"/>
-        <w:jc w:val="center"/>
-      </w:pPr>
-      <w:r>
-        <w:drawing>
-          <wp:inline xmlns:a="http://schemas.openxmlformats.org/drawingml/2006/main" xmlns:pic="http://schemas.openxmlformats.org/drawingml/2006/picture">
-            <wp:extent cx="5715000" cy="3429000"/>
-            <wp:docPr id="4" name="Picture 4" descr="Instalación en Android con Brave. Los nombres del menú pueden variar ligeramente."/>
-            <wp:cNvGraphicFramePr>
-              <a:graphicFrameLocks noChangeAspect="1"/>
-            </wp:cNvGraphicFramePr>
-            <a:graphic>
-              <a:graphicData uri="http://schemas.openxmlformats.org/drawingml/2006/picture">
-                <pic:pic>
-                  <pic:nvPicPr>
-                    <pic:cNvPr id="0" name="02-instalar-en-brave.png"/>
-                    <pic:cNvPicPr/>
-                  </pic:nvPicPr>
-                  <pic:blipFill>
-                    <a:blip r:embed="rId15"/>
-                    <a:stretch>
-                      <a:fillRect/>
-                    </a:stretch>
-                  </pic:blipFill>
-                  <pic:spPr>
-                    <a:xfrm>
-                      <a:off x="0" y="0"/>
-                      <a:ext cx="5715000" cy="3429000"/>
-                    </a:xfrm>
-                    <a:prstGeom prst="rect"/>
-                  </pic:spPr>
-                </pic:pic>
-              </a:graphicData>
-            </a:graphic>
-          </wp:inline>
-        </w:drawing>
-      </w:r>
-    </w:p>
-    <w:p>
-      <w:pPr>
-        <w:spacing w:before="0" w:after="160"/>
-        <w:jc w:val="center"/>
-      </w:pPr>
-      <w:r>
-        <w:rPr>
-          <w:rFonts w:ascii="Calibri" w:hAnsi="Calibri"/>
-          <w:i/>
-          <w:color w:val="5D6B78"/>
-          <w:sz w:val="17"/>
-        </w:rPr>
-        <w:t>Instalación en Android con Brave. Los nombres del menú pueden variar ligeramente.</w:t>
+        <w:t>Si un archivo tarda unos segundos en aparecer, espere antes de volver a enviarlo.</w:t>
       </w:r>
     </w:p>
     <w:p>
@@ -676,50 +649,12 @@
         <w:pStyle w:val="Heading2"/>
       </w:pPr>
       <w:r>
-        <w:t>iPhone o iPad</w:t>
+        <w:t>Recibir avisos</w:t>
       </w:r>
     </w:p>
     <w:p>
       <w:r>
-        <w:t>Abra el enlace en Safari, pulse Compartir y seleccione Añadir a pantalla de inicio.</w:t>
-      </w:r>
-    </w:p>
-    <w:p>
-      <w:pPr>
-        <w:pStyle w:val="Heading2"/>
-      </w:pPr>
-      <w:r>
-        <w:t>Ordenador</w:t>
-      </w:r>
-    </w:p>
-    <w:p>
-      <w:r>
-        <w:t>En Edge o Chrome, abra el enlace y pulse el icono Instalar situado en la barra de direcciones o en el menú del navegador.</w:t>
-      </w:r>
-    </w:p>
-    <w:p>
-      <w:pPr>
-        <w:spacing w:before="120" w:after="200" w:line="276" w:lineRule="auto"/>
-        <w:ind w:left="259" w:right="259"/>
-        <w:shd w:fill="FFF7E8"/>
-      </w:pPr>
-      <w:r>
-        <w:rPr>
-          <w:rFonts w:ascii="Calibri" w:hAnsi="Calibri"/>
-          <w:b/>
-          <w:color w:val="7A5A00"/>
-          <w:sz w:val="22"/>
-        </w:rPr>
-        <w:t>Si solo aparece «Añadir a pantalla de inicio»</w:t>
-        <w:br/>
-      </w:r>
-      <w:r>
-        <w:rPr>
-          <w:rFonts w:ascii="Calibri" w:hAnsi="Calibri"/>
-          <w:color w:val="183247"/>
-          <w:sz w:val="21"/>
-        </w:rPr>
-        <w:t>Recargue la página, espere unos segundos y compruebe que la ha abierto directamente en Brave o Chrome, no dentro del navegador interno de otra aplicación.</w:t>
+        <w:t>Cuando Gestinem solicite permiso para mostrar notificaciones, pulse Permitir. Puede cambiar esta opción posteriormente desde los ajustes del navegador o del dispositivo.</w:t>
       </w:r>
     </w:p>
     <w:p>
@@ -733,67 +668,87 @@
         <w:keepNext/>
       </w:pPr>
       <w:r>
-        <w:t>4. Enviar mensajes y documentos</w:t>
-      </w:r>
-    </w:p>
-    <w:p>
-      <w:r>
-        <w:t>Seleccione Laboral, Contable / Fiscal o Privado antes de escribir. La conversación muestra quién ha respondido desde Gestinem y conserva el historial del canal.</w:t>
+        <w:t>4. Seguridad y ayuda</w:t>
       </w:r>
     </w:p>
     <w:p>
       <w:pPr>
-        <w:spacing w:before="80" w:after="60"/>
-        <w:jc w:val="center"/>
+        <w:spacing w:after="100"/>
+        <w:ind w:left="547" w:hanging="274"/>
+        <w:numPr>
+          <w:ilvl w:val="0"/>
+          <w:numId w:val="12"/>
+        </w:numPr>
       </w:pPr>
       <w:r>
-        <w:drawing>
-          <wp:inline xmlns:a="http://schemas.openxmlformats.org/drawingml/2006/main" xmlns:pic="http://schemas.openxmlformats.org/drawingml/2006/picture">
-            <wp:extent cx="3154680" cy="4732020"/>
-            <wp:docPr id="5" name="Picture 5" descr="Vista orientativa de los canales, mensajes y adjuntos."/>
-            <wp:cNvGraphicFramePr>
-              <a:graphicFrameLocks noChangeAspect="1"/>
-            </wp:cNvGraphicFramePr>
-            <a:graphic>
-              <a:graphicData uri="http://schemas.openxmlformats.org/drawingml/2006/picture">
-                <pic:pic>
-                  <pic:nvPicPr>
-                    <pic:cNvPr id="0" name="03-canales-y-adjuntos.png"/>
-                    <pic:cNvPicPr/>
-                  </pic:nvPicPr>
-                  <pic:blipFill>
-                    <a:blip r:embed="rId16"/>
-                    <a:stretch>
-                      <a:fillRect/>
-                    </a:stretch>
-                  </pic:blipFill>
-                  <pic:spPr>
-                    <a:xfrm>
-                      <a:off x="0" y="0"/>
-                      <a:ext cx="3154680" cy="4732020"/>
-                    </a:xfrm>
-                    <a:prstGeom prst="rect"/>
-                  </pic:spPr>
-                </pic:pic>
-              </a:graphicData>
-            </a:graphic>
-          </wp:inline>
-        </w:drawing>
+        <w:rPr>
+          <w:rFonts w:ascii="Aptos" w:hAnsi="Aptos"/>
+          <w:b w:val="0"/>
+          <w:i w:val="0"/>
+          <w:color w:val="183247"/>
+          <w:sz w:val="22"/>
+        </w:rPr>
+        <w:t>No comparta su contraseña ni el enlace de invitación.</w:t>
       </w:r>
     </w:p>
     <w:p>
       <w:pPr>
-        <w:spacing w:before="0" w:after="160"/>
-        <w:jc w:val="center"/>
+        <w:spacing w:after="100"/>
+        <w:ind w:left="547" w:hanging="274"/>
+        <w:numPr>
+          <w:ilvl w:val="0"/>
+          <w:numId w:val="12"/>
+        </w:numPr>
       </w:pPr>
       <w:r>
         <w:rPr>
-          <w:rFonts w:ascii="Calibri" w:hAnsi="Calibri"/>
-          <w:i/>
-          <w:color w:val="5D6B78"/>
-          <w:sz w:val="17"/>
+          <w:rFonts w:ascii="Aptos" w:hAnsi="Aptos"/>
+          <w:b w:val="0"/>
+          <w:i w:val="0"/>
+          <w:color w:val="183247"/>
+          <w:sz w:val="22"/>
         </w:rPr>
-        <w:t>Vista orientativa de los canales, mensajes y adjuntos.</w:t>
+        <w:t>Compruebe que la dirección del navegador empieza por https://app.gestinem.es.</w:t>
+      </w:r>
+    </w:p>
+    <w:p>
+      <w:pPr>
+        <w:spacing w:after="100"/>
+        <w:ind w:left="547" w:hanging="274"/>
+        <w:numPr>
+          <w:ilvl w:val="0"/>
+          <w:numId w:val="12"/>
+        </w:numPr>
+      </w:pPr>
+      <w:r>
+        <w:rPr>
+          <w:rFonts w:ascii="Aptos" w:hAnsi="Aptos"/>
+          <w:b w:val="0"/>
+          <w:i w:val="0"/>
+          <w:color w:val="183247"/>
+          <w:sz w:val="22"/>
+        </w:rPr>
+        <w:t>Cierre la sesión si utiliza un ordenador compartido.</w:t>
+      </w:r>
+    </w:p>
+    <w:p>
+      <w:pPr>
+        <w:spacing w:after="100"/>
+        <w:ind w:left="547" w:hanging="274"/>
+        <w:numPr>
+          <w:ilvl w:val="0"/>
+          <w:numId w:val="12"/>
+        </w:numPr>
+      </w:pPr>
+      <w:r>
+        <w:rPr>
+          <w:rFonts w:ascii="Aptos" w:hAnsi="Aptos"/>
+          <w:b w:val="0"/>
+          <w:i w:val="0"/>
+          <w:color w:val="183247"/>
+          <w:sz w:val="22"/>
+        </w:rPr>
+        <w:t>Por seguridad, los avisos por correo no incluyen el contenido de sus mensajes.</w:t>
       </w:r>
     </w:p>
     <w:p>
@@ -801,331 +756,62 @@
         <w:pStyle w:val="Heading2"/>
       </w:pPr>
       <w:r>
-        <w:t>Adjuntar un documento</w:t>
+        <w:t>Si ha olvidado la contraseña</w:t>
+      </w:r>
+    </w:p>
+    <w:p>
+      <w:r>
+        <w:t>Pulse ¿Has olvidado tu contraseña? en la pantalla de acceso. Recibirá un enlace seguro para crear una nueva; el enlace caduca en una hora.</w:t>
       </w:r>
     </w:p>
     <w:p>
       <w:pPr>
-        <w:spacing w:after="80" w:line="300" w:lineRule="auto"/>
-        <w:ind w:left="540" w:hanging="271"/>
-        <w:numPr>
-          <w:ilvl w:val="0"/>
-          <w:numId w:val="13"/>
-        </w:numPr>
+        <w:spacing w:before="120" w:after="200" w:line="269" w:lineRule="auto"/>
+        <w:ind w:left="259" w:right="259"/>
+        <w:shd w:fill="EAF6EF"/>
       </w:pPr>
       <w:r>
         <w:rPr>
-          <w:rFonts w:ascii="Calibri" w:hAnsi="Calibri"/>
-          <w:color w:val="183247"/>
+          <w:rFonts w:ascii="Aptos" w:hAnsi="Aptos"/>
+          <w:b/>
+          <w:i w:val="0"/>
+          <w:color w:val="18794E"/>
           <w:sz w:val="22"/>
         </w:rPr>
-        <w:t>Entre en el canal relacionado con el documento.</w:t>
+        <w:t>¿Necesita ayuda?</w:t>
+        <w:br/>
+      </w:r>
+      <w:r>
+        <w:rPr>
+          <w:rFonts w:ascii="Aptos" w:hAnsi="Aptos"/>
+          <w:b w:val="0"/>
+          <w:i w:val="0"/>
+          <w:color w:val="183247"/>
+          <w:sz w:val="21"/>
+        </w:rPr>
+        <w:t>Si no recibe la invitación, revise la carpeta de correo no deseado. Para problemas de acceso o consultas urgentes, contacte con Gestinem por los medios habituales.</w:t>
       </w:r>
     </w:p>
     <w:p>
       <w:pPr>
-        <w:spacing w:after="80" w:line="300" w:lineRule="auto"/>
-        <w:ind w:left="540" w:hanging="271"/>
-        <w:numPr>
-          <w:ilvl w:val="0"/>
-          <w:numId w:val="13"/>
-        </w:numPr>
-      </w:pPr>
-      <w:r>
-        <w:rPr>
-          <w:rFonts w:ascii="Calibri" w:hAnsi="Calibri"/>
-          <w:color w:val="183247"/>
-          <w:sz w:val="22"/>
-        </w:rPr>
-        <w:t>Pulse Adjuntar y seleccione uno o varios archivos.</w:t>
-      </w:r>
-    </w:p>
-    <w:p>
-      <w:pPr>
-        <w:spacing w:after="80" w:line="300" w:lineRule="auto"/>
-        <w:ind w:left="540" w:hanging="271"/>
-        <w:numPr>
-          <w:ilvl w:val="0"/>
-          <w:numId w:val="13"/>
-        </w:numPr>
-      </w:pPr>
-      <w:r>
-        <w:rPr>
-          <w:rFonts w:ascii="Calibri" w:hAnsi="Calibri"/>
-          <w:color w:val="183247"/>
-          <w:sz w:val="22"/>
-        </w:rPr>
-        <w:t>Compruebe el nombre del archivo y pulse Enviar una sola vez.</w:t>
-      </w:r>
-    </w:p>
-    <w:p>
-      <w:pPr>
-        <w:spacing w:before="120" w:after="200" w:line="276" w:lineRule="auto"/>
-        <w:ind w:left="259" w:right="259"/>
-        <w:shd w:fill="EEF3F8"/>
-      </w:pPr>
-      <w:r>
-        <w:rPr>
-          <w:rFonts w:ascii="Calibri" w:hAnsi="Calibri"/>
-          <w:b/>
-          <w:color w:val="00345D"/>
-          <w:sz w:val="22"/>
-        </w:rPr>
-        <w:t>Formatos habituales</w:t>
-        <w:br/>
-      </w:r>
-      <w:r>
-        <w:rPr>
-          <w:rFonts w:ascii="Calibri" w:hAnsi="Calibri"/>
-          <w:color w:val="183247"/>
-          <w:sz w:val="21"/>
-        </w:rPr>
-        <w:t>Puede enviar PDF, imágenes, documentos de Word, hojas de cálculo, XML, CSV y ZIP. Use nombres claros, por ejemplo: Factura_Luz_Julio_2026.pdf.</w:t>
-      </w:r>
-    </w:p>
-    <w:p>
-      <w:r>
-        <w:br w:type="page"/>
-      </w:r>
-    </w:p>
-    <w:p>
-      <w:pPr>
-        <w:pStyle w:val="Heading1"/>
-        <w:keepNext/>
-      </w:pPr>
-      <w:r>
-        <w:t>5. Activar avisos</w:t>
-      </w:r>
-    </w:p>
-    <w:p>
-      <w:pPr>
-        <w:spacing w:after="240"/>
-      </w:pPr>
-      <w:r>
-        <w:rPr>
-          <w:rFonts w:ascii="Calibri" w:hAnsi="Calibri"/>
-          <w:color w:val="5D6B78"/>
-          <w:sz w:val="22"/>
-        </w:rPr>
-        <w:t>Reciba una notificación aunque la mensajería no esté abierta.</w:t>
-      </w:r>
-    </w:p>
-    <w:p>
-      <w:pPr>
-        <w:spacing w:before="80" w:after="60"/>
-        <w:jc w:val="center"/>
-      </w:pPr>
-      <w:r>
-        <w:drawing>
-          <wp:inline xmlns:a="http://schemas.openxmlformats.org/drawingml/2006/main" xmlns:pic="http://schemas.openxmlformats.org/drawingml/2006/picture">
-            <wp:extent cx="5577840" cy="2398471"/>
-            <wp:docPr id="6" name="Picture 6" descr="Botón para activar las notificaciones en el dispositivo."/>
-            <wp:cNvGraphicFramePr>
-              <a:graphicFrameLocks noChangeAspect="1"/>
-            </wp:cNvGraphicFramePr>
-            <a:graphic>
-              <a:graphicData uri="http://schemas.openxmlformats.org/drawingml/2006/picture">
-                <pic:pic>
-                  <pic:nvPicPr>
-                    <pic:cNvPr id="0" name="04-activar-avisos.png"/>
-                    <pic:cNvPicPr/>
-                  </pic:nvPicPr>
-                  <pic:blipFill>
-                    <a:blip r:embed="rId17"/>
-                    <a:stretch>
-                      <a:fillRect/>
-                    </a:stretch>
-                  </pic:blipFill>
-                  <pic:spPr>
-                    <a:xfrm>
-                      <a:off x="0" y="0"/>
-                      <a:ext cx="5577840" cy="2398471"/>
-                    </a:xfrm>
-                    <a:prstGeom prst="rect"/>
-                  </pic:spPr>
-                </pic:pic>
-              </a:graphicData>
-            </a:graphic>
-          </wp:inline>
-        </w:drawing>
-      </w:r>
-    </w:p>
-    <w:p>
-      <w:pPr>
-        <w:spacing w:before="0" w:after="160"/>
+        <w:spacing w:before="680"/>
         <w:jc w:val="center"/>
       </w:pPr>
       <w:r>
         <w:rPr>
-          <w:rFonts w:ascii="Calibri" w:hAnsi="Calibri"/>
-          <w:i/>
-          <w:color w:val="5D6B78"/>
-          <w:sz w:val="17"/>
-        </w:rPr>
-        <w:t>Botón para activar las notificaciones en el dispositivo.</w:t>
-      </w:r>
-    </w:p>
-    <w:p>
-      <w:pPr>
-        <w:spacing w:after="80" w:line="300" w:lineRule="auto"/>
-        <w:ind w:left="540" w:hanging="271"/>
-        <w:numPr>
-          <w:ilvl w:val="0"/>
-          <w:numId w:val="14"/>
-        </w:numPr>
-      </w:pPr>
-      <w:r>
-        <w:rPr>
-          <w:rFonts w:ascii="Calibri" w:hAnsi="Calibri"/>
-          <w:color w:val="183247"/>
-          <w:sz w:val="22"/>
-        </w:rPr>
-        <w:t>Entre en Mensajería Gestinem y pulse Activar avisos.</w:t>
-      </w:r>
-    </w:p>
-    <w:p>
-      <w:pPr>
-        <w:spacing w:after="80" w:line="300" w:lineRule="auto"/>
-        <w:ind w:left="540" w:hanging="271"/>
-        <w:numPr>
-          <w:ilvl w:val="0"/>
-          <w:numId w:val="14"/>
-        </w:numPr>
-      </w:pPr>
-      <w:r>
-        <w:rPr>
-          <w:rFonts w:ascii="Calibri" w:hAnsi="Calibri"/>
-          <w:color w:val="183247"/>
-          <w:sz w:val="22"/>
-        </w:rPr>
-        <w:t>Cuando el navegador lo solicite, pulse Permitir.</w:t>
-      </w:r>
-    </w:p>
-    <w:p>
-      <w:pPr>
-        <w:spacing w:after="80" w:line="300" w:lineRule="auto"/>
-        <w:ind w:left="540" w:hanging="271"/>
-        <w:numPr>
-          <w:ilvl w:val="0"/>
-          <w:numId w:val="14"/>
-        </w:numPr>
-      </w:pPr>
-      <w:r>
-        <w:rPr>
-          <w:rFonts w:ascii="Calibri" w:hAnsi="Calibri"/>
-          <w:color w:val="183247"/>
-          <w:sz w:val="22"/>
-        </w:rPr>
-        <w:t>Si aparece Avisos activos, la configuración ha terminado.</w:t>
-      </w:r>
-    </w:p>
-    <w:p>
-      <w:pPr>
-        <w:spacing w:before="120" w:after="200" w:line="276" w:lineRule="auto"/>
-        <w:ind w:left="259" w:right="259"/>
-        <w:shd w:fill="FFF7E8"/>
-      </w:pPr>
-      <w:r>
-        <w:rPr>
-          <w:rFonts w:ascii="Calibri" w:hAnsi="Calibri"/>
+          <w:rFonts w:ascii="Aptos" w:hAnsi="Aptos"/>
           <w:b/>
-          <w:color w:val="7A5A00"/>
-          <w:sz w:val="22"/>
-        </w:rPr>
-        <w:t>Si los avisos están bloqueados</w:t>
-        <w:br/>
-      </w:r>
-      <w:r>
-        <w:rPr>
-          <w:rFonts w:ascii="Calibri" w:hAnsi="Calibri"/>
-          <w:color w:val="183247"/>
-          <w:sz w:val="21"/>
-        </w:rPr>
-        <w:t>Abra Ajustes del teléfono &gt; Aplicaciones &gt; Brave, Chrome o Gestinem &gt; Notificaciones y permita los avisos. Después vuelva a abrir la aplicación.</w:t>
-      </w:r>
-    </w:p>
-    <w:p>
-      <w:pPr>
-        <w:pStyle w:val="Heading2"/>
-      </w:pPr>
-      <w:r>
-        <w:t>Buenas prácticas</w:t>
-      </w:r>
-    </w:p>
-    <w:p>
-      <w:pPr>
-        <w:spacing w:after="80" w:line="300" w:lineRule="auto"/>
-        <w:ind w:left="540" w:hanging="271"/>
-        <w:numPr>
-          <w:ilvl w:val="0"/>
-          <w:numId w:val="15"/>
-        </w:numPr>
-      </w:pPr>
-      <w:r>
-        <w:rPr>
-          <w:rFonts w:ascii="Calibri" w:hAnsi="Calibri"/>
-          <w:color w:val="183247"/>
-          <w:sz w:val="22"/>
-        </w:rPr>
-        <w:t>No comparta su contraseña con nadie, incluido el personal de Gestinem.</w:t>
-      </w:r>
-    </w:p>
-    <w:p>
-      <w:pPr>
-        <w:spacing w:after="80" w:line="300" w:lineRule="auto"/>
-        <w:ind w:left="540" w:hanging="271"/>
-        <w:numPr>
-          <w:ilvl w:val="0"/>
-          <w:numId w:val="15"/>
-        </w:numPr>
-      </w:pPr>
-      <w:r>
-        <w:rPr>
-          <w:rFonts w:ascii="Calibri" w:hAnsi="Calibri"/>
-          <w:color w:val="183247"/>
-          <w:sz w:val="22"/>
-        </w:rPr>
-        <w:t>Evite enviar el mismo documento varias veces si tarda unos segundos en aparecer.</w:t>
-      </w:r>
-    </w:p>
-    <w:p>
-      <w:pPr>
-        <w:spacing w:after="80" w:line="300" w:lineRule="auto"/>
-        <w:ind w:left="540" w:hanging="271"/>
-        <w:numPr>
-          <w:ilvl w:val="0"/>
-          <w:numId w:val="15"/>
-        </w:numPr>
-      </w:pPr>
-      <w:r>
-        <w:rPr>
-          <w:rFonts w:ascii="Calibri" w:hAnsi="Calibri"/>
-          <w:color w:val="183247"/>
-          <w:sz w:val="22"/>
-        </w:rPr>
-        <w:t>Para consultas urgentes o problemas de acceso, contacte con Gestinem por los medios habituales.</w:t>
-      </w:r>
-    </w:p>
-    <w:p>
-      <w:pPr>
-        <w:spacing w:before="440"/>
-        <w:jc w:val="center"/>
-      </w:pPr>
-      <w:r>
-        <w:rPr>
-          <w:rFonts w:ascii="Calibri" w:hAnsi="Calibri"/>
-          <w:b/>
-          <w:color w:val="00345D"/>
-          <w:sz w:val="24"/>
+          <w:i w:val="0"/>
+          <w:color w:val="0D2A6B"/>
+          <w:sz w:val="26"/>
         </w:rPr>
         <w:t>Gracias por ayudarnos a ofrecerle una atención más rápida, segura y organizada.</w:t>
       </w:r>
     </w:p>
     <w:sectPr>
       <w:footerReference w:type="default" r:id="rId9"/>
-      <w:footerReference w:type="even" r:id="rId10"/>
       <w:pgSz w:w="12240" w:h="15840"/>
-      <w:pgMar w:top="1440" w:right="1440" w:bottom="1440" w:left="1440" w:header="708" w:footer="708" w:gutter="0"/>
+      <w:pgMar w:top="1181" w:right="1296" w:bottom="1152" w:left="1296" w:header="720" w:footer="605" w:gutter="0"/>
       <w:cols w:space="720"/>
       <w:docGrid w:linePitch="360"/>
     </w:sectPr>
@@ -1142,44 +828,19 @@
     </w:pPr>
     <w:r>
       <w:rPr>
-        <w:rFonts w:ascii="Calibri" w:hAnsi="Calibri"/>
+        <w:rFonts w:ascii="Aptos" w:hAnsi="Aptos"/>
+        <w:b w:val="0"/>
+        <w:i w:val="0"/>
         <w:color w:val="5D6B78"/>
         <w:sz w:val="17"/>
       </w:rPr>
-      <w:t xml:space="preserve">Gestinem · Comunicación segura · </w:t>
+      <w:t xml:space="preserve">Gestinem · Guía para clientes · </w:t>
     </w:r>
     <w:r>
       <w:rPr>
-        <w:rFonts w:ascii="Calibri" w:hAnsi="Calibri"/>
-        <w:color w:val="5D6B78"/>
-        <w:sz w:val="17"/>
-      </w:rPr>
-      <w:fldChar w:fldCharType="begin"/>
-      <w:instrText xml:space="preserve"> PAGE </w:instrText>
-      <w:fldChar w:fldCharType="end"/>
-    </w:r>
-  </w:p>
-</w:ftr>
-</file>
-
-<file path=word/footer2.xml><?xml version="1.0" encoding="utf-8"?>
-<w:ftr xmlns:m="http://schemas.openxmlformats.org/officeDocument/2006/math" xmlns:mc="http://schemas.openxmlformats.org/markup-compatibility/2006" xmlns:mo="http://schemas.microsoft.com/office/mac/office/2008/main" xmlns:mv="urn:schemas-microsoft-com:mac:vml" xmlns:o="urn:schemas-microsoft-com:office:office" xmlns:r="http://schemas.openxmlformats.org/officeDocument/2006/relationships" xmlns:v="urn:schemas-microsoft-com:vml" xmlns:w10="urn:schemas-microsoft-com:office:word" xmlns:w14="http://schemas.microsoft.com/office/word/2010/wordml" xmlns:w="http://schemas.openxmlformats.org/wordprocessingml/2006/main" xmlns:wne="http://schemas.microsoft.com/office/word/2006/wordml" xmlns:wp14="http://schemas.microsoft.com/office/word/2010/wordprocessingDrawing" xmlns:wp="http://schemas.openxmlformats.org/drawingml/2006/wordprocessingDrawing" xmlns:wpc="http://schemas.microsoft.com/office/word/2010/wordprocessingCanvas" xmlns:wpg="http://schemas.microsoft.com/office/word/2010/wordprocessingGroup" xmlns:wpi="http://schemas.microsoft.com/office/word/2010/wordprocessingInk" xmlns:wps="http://schemas.microsoft.com/office/word/2010/wordprocessingShape" mc:Ignorable="w14 wp14">
-  <w:p>
-    <w:pPr>
-      <w:pStyle w:val="Footer"/>
-      <w:jc w:val="center"/>
-    </w:pPr>
-    <w:r>
-      <w:rPr>
-        <w:rFonts w:ascii="Calibri" w:hAnsi="Calibri"/>
-        <w:color w:val="5D6B78"/>
-        <w:sz w:val="17"/>
-      </w:rPr>
-      <w:t xml:space="preserve">Gestinem · Comunicación segura · </w:t>
-    </w:r>
-    <w:r>
-      <w:rPr>
-        <w:rFonts w:ascii="Calibri" w:hAnsi="Calibri"/>
+        <w:rFonts w:ascii="Aptos" w:hAnsi="Aptos"/>
+        <w:b w:val="0"/>
+        <w:i w:val="0"/>
         <w:color w:val="5D6B78"/>
         <w:sz w:val="17"/>
       </w:rPr>
@@ -1404,24 +1065,6 @@
     </w:lvlOverride>
   </w:num>
   <w:num w:numId="12">
-    <w:abstractNumId w:val="0"/>
-    <w:lvlOverride w:ilvl="0">
-      <w:startOverride w:val="1"/>
-    </w:lvlOverride>
-  </w:num>
-  <w:num w:numId="13">
-    <w:abstractNumId w:val="0"/>
-    <w:lvlOverride w:ilvl="0">
-      <w:startOverride w:val="1"/>
-    </w:lvlOverride>
-  </w:num>
-  <w:num w:numId="14">
-    <w:abstractNumId w:val="0"/>
-    <w:lvlOverride w:ilvl="0">
-      <w:startOverride w:val="1"/>
-    </w:lvlOverride>
-  </w:num>
-  <w:num w:numId="15">
     <w:abstractNumId w:val="4"/>
   </w:num>
 </w:numbering>
@@ -1588,10 +1231,10 @@
     <w:qFormat/>
     <w:rsid w:val="00FC693F"/>
     <w:pPr>
-      <w:spacing w:before="0" w:after="120" w:line="300" w:lineRule="auto"/>
+      <w:spacing w:before="0" w:after="120" w:line="283" w:lineRule="auto"/>
     </w:pPr>
     <w:rPr>
-      <w:rFonts w:ascii="Calibri" w:hAnsi="Calibri"/>
+      <w:rFonts w:ascii="Aptos" w:hAnsi="Aptos"/>
       <w:b w:val="0"/>
       <w:color w:val="183247"/>
       <w:sz w:val="22"/>
@@ -1652,15 +1295,15 @@
     <w:pPr>
       <w:keepNext/>
       <w:keepLines/>
-      <w:spacing w:before="360" w:after="200" w:line="240" w:lineRule="auto"/>
+      <w:spacing w:before="200" w:after="180" w:line="240" w:lineRule="auto"/>
       <w:outlineLvl w:val="0"/>
     </w:pPr>
     <w:rPr>
-      <w:rFonts w:asciiTheme="majorHAnsi" w:eastAsiaTheme="majorEastAsia" w:hAnsiTheme="majorHAnsi" w:cstheme="majorBidi" w:ascii="Calibri" w:hAnsi="Calibri"/>
+      <w:rFonts w:asciiTheme="majorHAnsi" w:eastAsiaTheme="majorEastAsia" w:hAnsiTheme="majorHAnsi" w:cstheme="majorBidi" w:ascii="Aptos" w:hAnsi="Aptos"/>
       <w:b/>
       <w:bCs/>
-      <w:color w:val="00345D"/>
-      <w:sz w:val="32"/>
+      <w:color w:val="0D2A6B"/>
+      <w:sz w:val="34"/>
       <w:szCs w:val="28"/>
     </w:rPr>
   </w:style>
@@ -1676,11 +1319,11 @@
     <w:pPr>
       <w:keepNext/>
       <w:keepLines/>
-      <w:spacing w:before="280" w:after="140" w:line="240" w:lineRule="auto"/>
+      <w:spacing w:before="240" w:after="120" w:line="240" w:lineRule="auto"/>
       <w:outlineLvl w:val="1"/>
     </w:pPr>
     <w:rPr>
-      <w:rFonts w:asciiTheme="majorHAnsi" w:eastAsiaTheme="majorEastAsia" w:hAnsiTheme="majorHAnsi" w:cstheme="majorBidi" w:ascii="Calibri" w:hAnsi="Calibri"/>
+      <w:rFonts w:asciiTheme="majorHAnsi" w:eastAsiaTheme="majorEastAsia" w:hAnsiTheme="majorHAnsi" w:cstheme="majorBidi" w:ascii="Aptos" w:hAnsi="Aptos"/>
       <w:b/>
       <w:bCs/>
       <w:color w:val="0759AF"/>
@@ -1700,15 +1343,14 @@
     <w:pPr>
       <w:keepNext/>
       <w:keepLines/>
-      <w:spacing w:before="200" w:after="100" w:line="240" w:lineRule="auto"/>
+      <w:spacing w:before="200" w:after="0"/>
       <w:outlineLvl w:val="2"/>
     </w:pPr>
     <w:rPr>
-      <w:rFonts w:asciiTheme="majorHAnsi" w:eastAsiaTheme="majorEastAsia" w:hAnsiTheme="majorHAnsi" w:cstheme="majorBidi" w:ascii="Calibri" w:hAnsi="Calibri"/>
+      <w:rFonts w:asciiTheme="majorHAnsi" w:eastAsiaTheme="majorEastAsia" w:hAnsiTheme="majorHAnsi" w:cstheme="majorBidi"/>
       <w:b/>
       <w:bCs/>
-      <w:color w:val="00345D"/>
-      <w:sz w:val="24"/>
+      <w:color w:val="4F81BD" w:themeColor="accent1"/>
     </w:rPr>
   </w:style>
   <w:style w:type="paragraph" w:styleId="Heading4">

</xml_diff>